<commit_message>
Invoice: drop the logo and fraud-warning box, date it 21 August 2026
Terms move up alongside the payment details so the space the warning box
left is filled, and the item rows get their breathing room back. Still one
page. The blank template keeps a date placeholder so a reused invoice
cannot go out carrying today's date.

Co-Authored-By: Claude Fable 5 <noreply@anthropic.com>
Claude-Session: https://claude.ai/code/session_01VJrbxoPEUBK1o482gxajXL
</commit_message>
<xml_diff>
--- a/conveyancing/invoices/HAA-Invoice-TEMPLATE.docx
+++ b/conveyancing/invoices/HAA-Invoice-TEMPLATE.docx
@@ -36,51 +36,6 @@
             </w:tcMar>
             <w:vAlign w:val="top"/>
           </w:tcPr>
-          <w:p>
-            <w:pPr>
-              <w:spacing w:after="60"/>
-            </w:pPr>
-            <w:r>
-              <w:drawing>
-                <wp:inline distT="0" distB="0" distL="0" distR="0">
-                  <wp:extent cx="381000" cy="352425"/>
-                  <wp:effectExtent t="0" r="0" b="0" l="0"/>
-                  <wp:docPr id="1" name="" descr="" title=""/>
-                  <wp:cNvGraphicFramePr>
-                    <a:graphicFrameLocks xmlns:a="http://schemas.openxmlformats.org/drawingml/2006/main" noChangeAspect="1"/>
-                  </wp:cNvGraphicFramePr>
-                  <a:graphic xmlns:a="http://schemas.openxmlformats.org/drawingml/2006/main">
-                    <a:graphicData uri="http://schemas.openxmlformats.org/drawingml/2006/picture">
-                      <pic:pic xmlns:pic="http://schemas.openxmlformats.org/drawingml/2006/picture">
-                        <pic:nvPicPr>
-                          <pic:cNvPr id="0" name="" descr=""/>
-                          <pic:cNvPicPr>
-                            <a:picLocks noChangeAspect="1" noChangeArrowheads="1"/>
-                          </pic:cNvPicPr>
-                        </pic:nvPicPr>
-                        <pic:blipFill>
-                          <a:blip r:embed="rId7" cstate="none"/>
-                          <a:srcRect/>
-                          <a:stretch>
-                            <a:fillRect/>
-                          </a:stretch>
-                        </pic:blipFill>
-                        <pic:spPr bwMode="auto">
-                          <a:xfrm>
-                            <a:off x="0" y="0"/>
-                            <a:ext cx="381000" cy="352425"/>
-                          </a:xfrm>
-                          <a:prstGeom prst="rect">
-                            <a:avLst/>
-                          </a:prstGeom>
-                        </pic:spPr>
-                      </pic:pic>
-                    </a:graphicData>
-                  </a:graphic>
-                </wp:inline>
-              </w:drawing>
-            </w:r>
-          </w:p>
           <w:p>
             <w:pPr>
               <w:spacing w:after="20" w:before="0" w:line="240"/>
@@ -2513,7 +2468,7 @@
               <w:bottom w:val="none" w:color="FFFFFF" w:sz="0"/>
               <w:right w:val="none" w:color="FFFFFF" w:sz="0"/>
             </w:tcBorders>
-            <w:shd w:fill="FBF3F2" w:color="auto" w:val="clear"/>
+            <w:shd w:fill="FAF8F4" w:color="auto" w:val="clear"/>
             <w:tcMar>
               <w:top w:type="dxa" w:w="190"/>
               <w:left w:type="dxa" w:w="220"/>
@@ -2531,26 +2486,69 @@
                 <w:rFonts w:ascii="Arial" w:cs="Arial" w:eastAsia="Arial" w:hAnsi="Arial"/>
                 <w:b/>
                 <w:bCs/>
-                <w:color w:val="A33328"/>
-                <w:spacing w:val="35"/>
+                <w:caps/>
+                <w:color w:val="B58C4B"/>
+                <w:spacing w:val="55"/>
                 <w:sz w:val="13"/>
                 <w:szCs w:val="13"/>
               </w:rPr>
-              <w:t xml:space="preserve">IMPORTANT — BANKING DETAILS &amp; FRAUD WARNING</w:t>
-            </w:r>
-          </w:p>
-          <w:p>
-            <w:pPr>
-              <w:spacing w:after="0" w:before="0" w:line="240"/>
-            </w:pPr>
-            <w:r>
-              <w:rPr>
-                <w:rFonts w:ascii="Arial" w:cs="Arial" w:eastAsia="Arial" w:hAnsi="Arial"/>
-                <w:color w:val="6B4A45"/>
+              <w:t xml:space="preserve">Terms</w:t>
+            </w:r>
+          </w:p>
+          <w:p>
+            <w:pPr>
+              <w:spacing w:after="90" w:before="0" w:line="240"/>
+            </w:pPr>
+            <w:r>
+              <w:rPr>
+                <w:rFonts w:ascii="Arial" w:cs="Arial" w:eastAsia="Arial" w:hAnsi="Arial"/>
+                <w:color w:val="55647A"/>
                 <w:sz w:val="14"/>
                 <w:szCs w:val="14"/>
               </w:rPr>
-              <w:t xml:space="preserve">These banking details do not change. We will never email you new or amended account details. Before making any payment, please telephone this office on 083 619 2313 — using a number you have independently verified — and confirm the account details verbally. No liability can be accepted for funds paid into an account other than the one confirmed by us in person or telephonically.</w:t>
+              <w:t xml:space="preserve">1.  This invoice is payable on presentation unless otherwise agreed in writing.</w:t>
+            </w:r>
+          </w:p>
+          <w:p>
+            <w:pPr>
+              <w:spacing w:after="90" w:before="0" w:line="240"/>
+            </w:pPr>
+            <w:r>
+              <w:rPr>
+                <w:rFonts w:ascii="Arial" w:cs="Arial" w:eastAsia="Arial" w:hAnsi="Arial"/>
+                <w:color w:val="55647A"/>
+                <w:sz w:val="14"/>
+                <w:szCs w:val="14"/>
+              </w:rPr>
+              <w:t xml:space="preserve">2.  Third-party registration and subscription costs are recovered at cost; supporting invoices are available on request.</w:t>
+            </w:r>
+          </w:p>
+          <w:p>
+            <w:pPr>
+              <w:spacing w:after="90" w:before="0" w:line="240"/>
+            </w:pPr>
+            <w:r>
+              <w:rPr>
+                <w:rFonts w:ascii="Arial" w:cs="Arial" w:eastAsia="Arial" w:hAnsi="Arial"/>
+                <w:color w:val="55647A"/>
+                <w:sz w:val="14"/>
+                <w:szCs w:val="14"/>
+              </w:rPr>
+              <w:t xml:space="preserve">3.  Any query on this account must be raised within 30 days of the date of invoice.</w:t>
+            </w:r>
+          </w:p>
+          <w:p>
+            <w:pPr>
+              <w:spacing w:after="90" w:before="0" w:line="240"/>
+            </w:pPr>
+            <w:r>
+              <w:rPr>
+                <w:rFonts w:ascii="Arial" w:cs="Arial" w:eastAsia="Arial" w:hAnsi="Arial"/>
+                <w:color w:val="55647A"/>
+                <w:sz w:val="14"/>
+                <w:szCs w:val="14"/>
+              </w:rPr>
+              <w:t xml:space="preserve">4.  Ownership of any design work supplied passes to the client on receipt of payment in full.</w:t>
             </w:r>
           </w:p>
         </w:tc>
@@ -2558,86 +2556,7 @@
     </w:tbl>
     <w:p>
       <w:pPr>
-        <w:spacing w:after="240"/>
-      </w:pPr>
-    </w:p>
-    <w:p>
-      <w:pPr>
-        <w:spacing w:after="80" w:before="0" w:line="240"/>
-      </w:pPr>
-      <w:r>
-        <w:rPr>
-          <w:rFonts w:ascii="Arial" w:cs="Arial" w:eastAsia="Arial" w:hAnsi="Arial"/>
-          <w:b/>
-          <w:bCs/>
-          <w:caps/>
-          <w:color w:val="B58C4B"/>
-          <w:spacing w:val="55"/>
-          <w:sz w:val="13"/>
-          <w:szCs w:val="13"/>
-        </w:rPr>
-        <w:t xml:space="preserve">Terms</w:t>
-      </w:r>
-    </w:p>
-    <w:p>
-      <w:pPr>
-        <w:spacing w:after="45" w:before="0" w:line="240"/>
-      </w:pPr>
-      <w:r>
-        <w:rPr>
-          <w:rFonts w:ascii="Arial" w:cs="Arial" w:eastAsia="Arial" w:hAnsi="Arial"/>
-          <w:color w:val="55647A"/>
-          <w:sz w:val="14"/>
-          <w:szCs w:val="14"/>
-        </w:rPr>
-        <w:t xml:space="preserve">1.  This invoice is payable on presentation unless otherwise agreed in writing.</w:t>
-      </w:r>
-    </w:p>
-    <w:p>
-      <w:pPr>
-        <w:spacing w:after="45" w:before="0" w:line="240"/>
-      </w:pPr>
-      <w:r>
-        <w:rPr>
-          <w:rFonts w:ascii="Arial" w:cs="Arial" w:eastAsia="Arial" w:hAnsi="Arial"/>
-          <w:color w:val="55647A"/>
-          <w:sz w:val="14"/>
-          <w:szCs w:val="14"/>
-        </w:rPr>
-        <w:t xml:space="preserve">2.  Third-party registration and subscription costs are recovered at cost; supporting invoices are available on request.</w:t>
-      </w:r>
-    </w:p>
-    <w:p>
-      <w:pPr>
-        <w:spacing w:after="45" w:before="0" w:line="240"/>
-      </w:pPr>
-      <w:r>
-        <w:rPr>
-          <w:rFonts w:ascii="Arial" w:cs="Arial" w:eastAsia="Arial" w:hAnsi="Arial"/>
-          <w:color w:val="55647A"/>
-          <w:sz w:val="14"/>
-          <w:szCs w:val="14"/>
-        </w:rPr>
-        <w:t xml:space="preserve">3.  Any query on this account must be raised within 30 days of the date of invoice.</w:t>
-      </w:r>
-    </w:p>
-    <w:p>
-      <w:pPr>
-        <w:spacing w:after="45" w:before="0" w:line="240"/>
-      </w:pPr>
-      <w:r>
-        <w:rPr>
-          <w:rFonts w:ascii="Arial" w:cs="Arial" w:eastAsia="Arial" w:hAnsi="Arial"/>
-          <w:color w:val="55647A"/>
-          <w:sz w:val="14"/>
-          <w:szCs w:val="14"/>
-        </w:rPr>
-        <w:t xml:space="preserve">4.  Ownership of any design work supplied passes to the client on receipt of payment in full.</w:t>
-      </w:r>
-    </w:p>
-    <w:p>
-      <w:pPr>
-        <w:spacing w:after="160"/>
+        <w:spacing w:after="260"/>
       </w:pPr>
     </w:p>
     <w:p>

</xml_diff>

<commit_message>
Invoice: Maryke's own address on the letterhead, VAT field removed
Letterhead and footer now carry 673B Skukuza Street, Faerie Glen, Pretoria,
0081. No VAT is charged, so the empty 'VAT reg. no.' row goes rather than
printing an unfilled placeholder; the total is unchanged at R 28 517.40.

Co-Authored-By: Claude Fable 5 <noreply@anthropic.com>
Claude-Session: https://claude.ai/code/session_01VJrbxoPEUBK1o482gxajXL
</commit_message>
<xml_diff>
--- a/conveyancing/invoices/HAA-Invoice-TEMPLATE.docx
+++ b/conveyancing/invoices/HAA-Invoice-TEMPLATE.docx
@@ -79,7 +79,7 @@
                 <w:sz w:val="15"/>
                 <w:szCs w:val="15"/>
               </w:rPr>
-              <w:t xml:space="preserve">59 Bolo Street, Moreleta Park</w:t>
+              <w:t xml:space="preserve">673B Skukuza Street, Faerie Glen</w:t>
             </w:r>
           </w:p>
           <w:p>
@@ -93,7 +93,7 @@
                 <w:sz w:val="15"/>
                 <w:szCs w:val="15"/>
               </w:rPr>
-              <w:t xml:space="preserve">Pretoria, 0181</w:t>
+              <w:t xml:space="preserve">Pretoria, 0081</w:t>
             </w:r>
           </w:p>
           <w:p>
@@ -466,78 +466,6 @@
                       <w:szCs w:val="17"/>
                     </w:rPr>
                     <w:t xml:space="preserve">Maryke Dique</w:t>
-                  </w:r>
-                </w:p>
-              </w:tc>
-            </w:tr>
-            <w:tr>
-              <w:tc>
-                <w:tcPr>
-                  <w:tcW w:type="dxa" w:w="1700"/>
-                  <w:tcBorders>
-                    <w:top w:val="none" w:color="FFFFFF" w:sz="0"/>
-                    <w:left w:val="none" w:color="FFFFFF" w:sz="0"/>
-                    <w:bottom w:val="none" w:color="FFFFFF" w:sz="0"/>
-                    <w:right w:val="none" w:color="FFFFFF" w:sz="0"/>
-                  </w:tcBorders>
-                  <w:tcMar>
-                    <w:top w:type="dxa" w:w="25"/>
-                    <w:left w:type="dxa" w:w="0"/>
-                    <w:bottom w:type="dxa" w:w="25"/>
-                    <w:right w:type="dxa" w:w="150"/>
-                  </w:tcMar>
-                </w:tcPr>
-                <w:p>
-                  <w:pPr>
-                    <w:spacing w:after="0" w:before="0" w:line="240"/>
-                    <w:jc w:val="right"/>
-                  </w:pPr>
-                  <w:r>
-                    <w:rPr>
-                      <w:rFonts w:ascii="Arial" w:cs="Arial" w:eastAsia="Arial" w:hAnsi="Arial"/>
-                      <w:caps/>
-                      <w:color w:val="93A0B2"/>
-                      <w:spacing w:val="25"/>
-                      <w:sz w:val="13"/>
-                      <w:szCs w:val="13"/>
-                    </w:rPr>
-                    <w:t xml:space="preserve">VAT reg. no.</w:t>
-                  </w:r>
-                </w:p>
-              </w:tc>
-              <w:tc>
-                <w:tcPr>
-                  <w:tcW w:type="dxa" w:w="2400"/>
-                  <w:tcBorders>
-                    <w:top w:val="none" w:color="FFFFFF" w:sz="0"/>
-                    <w:left w:val="none" w:color="FFFFFF" w:sz="0"/>
-                    <w:bottom w:val="none" w:color="FFFFFF" w:sz="0"/>
-                    <w:right w:val="none" w:color="FFFFFF" w:sz="0"/>
-                  </w:tcBorders>
-                  <w:tcMar>
-                    <w:top w:type="dxa" w:w="25"/>
-                    <w:left w:type="dxa" w:w="0"/>
-                    <w:bottom w:type="dxa" w:w="25"/>
-                    <w:right w:type="dxa" w:w="0"/>
-                  </w:tcMar>
-                </w:tcPr>
-                <w:p>
-                  <w:pPr>
-                    <w:spacing w:after="0" w:before="0" w:line="240"/>
-                    <w:jc w:val="right"/>
-                  </w:pPr>
-                  <w:r>
-                    <w:rPr>
-                      <w:rFonts w:ascii="Arial" w:cs="Arial" w:eastAsia="Arial" w:hAnsi="Arial"/>
-                      <w:b/>
-                      <w:bCs/>
-                      <w:i/>
-                      <w:iCs/>
-                      <w:color w:val="9AA6B6"/>
-                      <w:sz w:val="17"/>
-                      <w:szCs w:val="17"/>
-                    </w:rPr>
-                    <w:t xml:space="preserve">[if registered]</w:t>
                   </w:r>
                 </w:p>
               </w:tc>
@@ -2609,7 +2537,7 @@
           <w:sz w:val="13"/>
           <w:szCs w:val="13"/>
         </w:rPr>
-        <w:t xml:space="preserve">   ·   59 Bolo Street, Moreleta Park, Pretoria   ·   E &amp; OE</w:t>
+        <w:t xml:space="preserve">   ·   673B Skukuza Street, Faerie Glen, Pretoria   ·   E &amp; OE</w:t>
       </w:r>
     </w:p>
     <w:sectPr>

</xml_diff>

<commit_message>
Invoice: bill H Annandale, drop the terms block
The invoice runs from Maryke to the firm, so the letterhead and footer now
carry her name, address and phone rather than Annandale's, and Annandale
(attention Hesca) fills the 'Invoice to' block. Company reg. no. drops out
with it — an individual has none. Terms removed; the payment card holds a
half-width column so it does not stretch across the page.

Co-Authored-By: Claude Fable 5 <noreply@anthropic.com>
Claude-Session: https://claude.ai/code/session_01VJrbxoPEUBK1o482gxajXL
</commit_message>
<xml_diff>
--- a/conveyancing/invoices/HAA-Invoice-TEMPLATE.docx
+++ b/conveyancing/invoices/HAA-Invoice-TEMPLATE.docx
@@ -38,7 +38,7 @@
           </w:tcPr>
           <w:p>
             <w:pPr>
-              <w:spacing w:after="20" w:before="0" w:line="240"/>
+              <w:spacing w:after="150" w:before="0" w:line="240"/>
             </w:pPr>
             <w:r>
               <w:rPr>
@@ -50,22 +50,7 @@
                 <w:sz w:val="26"/>
                 <w:szCs w:val="26"/>
               </w:rPr>
-              <w:t xml:space="preserve">H ANNANDALE</w:t>
-            </w:r>
-          </w:p>
-          <w:p>
-            <w:pPr>
-              <w:spacing w:after="150" w:before="0" w:line="240"/>
-            </w:pPr>
-            <w:r>
-              <w:rPr>
-                <w:rFonts w:ascii="Arial" w:cs="Arial" w:eastAsia="Arial" w:hAnsi="Arial"/>
-                <w:color w:val="B58C4B"/>
-                <w:spacing w:val="80"/>
-                <w:sz w:val="11"/>
-                <w:szCs w:val="11"/>
-              </w:rPr>
-              <w:t xml:space="preserve">ATTORNEYS INC.</w:t>
+              <w:t xml:space="preserve">MARYKE DIQUE</w:t>
             </w:r>
           </w:p>
           <w:p>
@@ -572,6 +557,22 @@
                 <w:sz w:val="17"/>
                 <w:szCs w:val="17"/>
               </w:rPr>
+              <w:t xml:space="preserve">[Attention]</w:t>
+            </w:r>
+          </w:p>
+          <w:p>
+            <w:pPr>
+              <w:spacing w:after="40" w:before="0" w:line="240"/>
+            </w:pPr>
+            <w:r>
+              <w:rPr>
+                <w:rFonts w:ascii="Arial" w:cs="Arial" w:eastAsia="Arial" w:hAnsi="Arial"/>
+                <w:i/>
+                <w:iCs/>
+                <w:color w:val="9AA6B6"/>
+                <w:sz w:val="17"/>
+                <w:szCs w:val="17"/>
+              </w:rPr>
               <w:t xml:space="preserve">[Address line 1]</w:t>
             </w:r>
           </w:p>
@@ -593,7 +594,7 @@
           </w:p>
           <w:p>
             <w:pPr>
-              <w:spacing w:after="40" w:before="0" w:line="240"/>
+              <w:spacing w:after="0" w:before="0" w:line="240"/>
             </w:pPr>
             <w:r>
               <w:rPr>
@@ -605,22 +606,6 @@
                 <w:szCs w:val="17"/>
               </w:rPr>
               <w:t xml:space="preserve">[Email address]</w:t>
-            </w:r>
-          </w:p>
-          <w:p>
-            <w:pPr>
-              <w:spacing w:after="0" w:before="0" w:line="240"/>
-            </w:pPr>
-            <w:r>
-              <w:rPr>
-                <w:rFonts w:ascii="Arial" w:cs="Arial" w:eastAsia="Arial" w:hAnsi="Arial"/>
-                <w:i/>
-                <w:iCs/>
-                <w:color w:val="9AA6B6"/>
-                <w:sz w:val="17"/>
-                <w:szCs w:val="17"/>
-              </w:rPr>
-              <w:t xml:space="preserve">[Company / VAT reg. no.]</w:t>
             </w:r>
           </w:p>
         </w:tc>
@@ -2135,8 +2120,7 @@
       </w:tblPr>
       <w:tblGrid>
         <w:gridCol w:w="4952"/>
-        <w:gridCol w:w="300"/>
-        <w:gridCol w:w="4952"/>
+        <w:gridCol w:w="5252"/>
       </w:tblGrid>
       <w:tr>
         <w:tc>
@@ -2371,7 +2355,7 @@
         </w:tc>
         <w:tc>
           <w:tcPr>
-            <w:tcW w:type="dxa" w:w="300"/>
+            <w:tcW w:type="dxa" w:w="5252"/>
             <w:tcBorders>
               <w:top w:val="none" w:color="FFFFFF" w:sz="0"/>
               <w:left w:val="none" w:color="FFFFFF" w:sz="0"/>
@@ -2386,99 +2370,6 @@
             </w:tcMar>
           </w:tcPr>
           <w:p/>
-        </w:tc>
-        <w:tc>
-          <w:tcPr>
-            <w:tcW w:type="dxa" w:w="4952"/>
-            <w:tcBorders>
-              <w:top w:val="none" w:color="FFFFFF" w:sz="0"/>
-              <w:left w:val="none" w:color="FFFFFF" w:sz="0"/>
-              <w:bottom w:val="none" w:color="FFFFFF" w:sz="0"/>
-              <w:right w:val="none" w:color="FFFFFF" w:sz="0"/>
-            </w:tcBorders>
-            <w:shd w:fill="FAF8F4" w:color="auto" w:val="clear"/>
-            <w:tcMar>
-              <w:top w:type="dxa" w:w="190"/>
-              <w:left w:type="dxa" w:w="220"/>
-              <w:bottom w:type="dxa" w:w="190"/>
-              <w:right w:type="dxa" w:w="200"/>
-            </w:tcMar>
-            <w:vAlign w:val="top"/>
-          </w:tcPr>
-          <w:p>
-            <w:pPr>
-              <w:spacing w:after="80" w:before="0" w:line="240"/>
-            </w:pPr>
-            <w:r>
-              <w:rPr>
-                <w:rFonts w:ascii="Arial" w:cs="Arial" w:eastAsia="Arial" w:hAnsi="Arial"/>
-                <w:b/>
-                <w:bCs/>
-                <w:caps/>
-                <w:color w:val="B58C4B"/>
-                <w:spacing w:val="55"/>
-                <w:sz w:val="13"/>
-                <w:szCs w:val="13"/>
-              </w:rPr>
-              <w:t xml:space="preserve">Terms</w:t>
-            </w:r>
-          </w:p>
-          <w:p>
-            <w:pPr>
-              <w:spacing w:after="90" w:before="0" w:line="240"/>
-            </w:pPr>
-            <w:r>
-              <w:rPr>
-                <w:rFonts w:ascii="Arial" w:cs="Arial" w:eastAsia="Arial" w:hAnsi="Arial"/>
-                <w:color w:val="55647A"/>
-                <w:sz w:val="14"/>
-                <w:szCs w:val="14"/>
-              </w:rPr>
-              <w:t xml:space="preserve">1.  This invoice is payable on presentation unless otherwise agreed in writing.</w:t>
-            </w:r>
-          </w:p>
-          <w:p>
-            <w:pPr>
-              <w:spacing w:after="90" w:before="0" w:line="240"/>
-            </w:pPr>
-            <w:r>
-              <w:rPr>
-                <w:rFonts w:ascii="Arial" w:cs="Arial" w:eastAsia="Arial" w:hAnsi="Arial"/>
-                <w:color w:val="55647A"/>
-                <w:sz w:val="14"/>
-                <w:szCs w:val="14"/>
-              </w:rPr>
-              <w:t xml:space="preserve">2.  Third-party registration and subscription costs are recovered at cost; supporting invoices are available on request.</w:t>
-            </w:r>
-          </w:p>
-          <w:p>
-            <w:pPr>
-              <w:spacing w:after="90" w:before="0" w:line="240"/>
-            </w:pPr>
-            <w:r>
-              <w:rPr>
-                <w:rFonts w:ascii="Arial" w:cs="Arial" w:eastAsia="Arial" w:hAnsi="Arial"/>
-                <w:color w:val="55647A"/>
-                <w:sz w:val="14"/>
-                <w:szCs w:val="14"/>
-              </w:rPr>
-              <w:t xml:space="preserve">3.  Any query on this account must be raised within 30 days of the date of invoice.</w:t>
-            </w:r>
-          </w:p>
-          <w:p>
-            <w:pPr>
-              <w:spacing w:after="90" w:before="0" w:line="240"/>
-            </w:pPr>
-            <w:r>
-              <w:rPr>
-                <w:rFonts w:ascii="Arial" w:cs="Arial" w:eastAsia="Arial" w:hAnsi="Arial"/>
-                <w:color w:val="55647A"/>
-                <w:sz w:val="14"/>
-                <w:szCs w:val="14"/>
-              </w:rPr>
-              <w:t xml:space="preserve">4.  Ownership of any design work supplied passes to the client on receipt of payment in full.</w:t>
-            </w:r>
-          </w:p>
         </w:tc>
       </w:tr>
     </w:tbl>
@@ -2508,7 +2399,7 @@
           <w:sz w:val="13"/>
           <w:szCs w:val="13"/>
         </w:rPr>
-        <w:t xml:space="preserve">H Annandale Attorneys Inc.</w:t>
+        <w:t xml:space="preserve">Maryke Dique</w:t>
       </w:r>
       <w:r>
         <w:rPr>
@@ -2517,27 +2408,7 @@
           <w:sz w:val="13"/>
           <w:szCs w:val="13"/>
         </w:rPr>
-        <w:t xml:space="preserve">   ·   Reg. no. </w:t>
-      </w:r>
-      <w:r>
-        <w:rPr>
-          <w:rFonts w:ascii="Arial" w:cs="Arial" w:eastAsia="Arial" w:hAnsi="Arial"/>
-          <w:i/>
-          <w:iCs/>
-          <w:color w:val="9AA6B6"/>
-          <w:sz w:val="13"/>
-          <w:szCs w:val="13"/>
-        </w:rPr>
-        <w:t xml:space="preserve">[Company reg. no.]</w:t>
-      </w:r>
-      <w:r>
-        <w:rPr>
-          <w:rFonts w:ascii="Arial" w:cs="Arial" w:eastAsia="Arial" w:hAnsi="Arial"/>
-          <w:color w:val="93A0B2"/>
-          <w:sz w:val="13"/>
-          <w:szCs w:val="13"/>
-        </w:rPr>
-        <w:t xml:space="preserve">   ·   673B Skukuza Street, Faerie Glen, Pretoria   ·   E &amp; OE</w:t>
+        <w:t xml:space="preserve">   ·   673B Skukuza Street, Faerie Glen, Pretoria, 0081   ·   083 619 2313   ·   E &amp; OE</w:t>
       </w:r>
     </w:p>
     <w:sectPr>

</xml_diff>

<commit_message>
Invoice: fix the Word layout spilling onto a second page
The .docx had never been rendered — libreoffice-writer was missing, so every
conversion failed and the layout went unverified. With Writer installed the
footer turned out to run onto page 2. Tightened the page margins and the gaps
around the payment card, and cut the blank template to ten rows; both files
now come out as a single page. README records the check.

Co-Authored-By: Claude Fable 5 <noreply@anthropic.com>
Claude-Session: https://claude.ai/code/session_01VJrbxoPEUBK1o482gxajXL
</commit_message>
<xml_diff>
--- a/conveyancing/invoices/HAA-Invoice-TEMPLATE.docx
+++ b/conveyancing/invoices/HAA-Invoice-TEMPLATE.docx
@@ -1798,144 +1798,6 @@
           </w:p>
         </w:tc>
       </w:tr>
-      <w:tr>
-        <w:tc>
-          <w:tcPr>
-            <w:tcW w:type="dxa" w:w="7704"/>
-            <w:tcBorders>
-              <w:top w:val="none" w:color="FFFFFF" w:sz="0"/>
-              <w:left w:val="none" w:color="FFFFFF" w:sz="0"/>
-              <w:bottom w:val="single" w:color="E3DDD2" w:sz="3"/>
-              <w:right w:val="none" w:color="FFFFFF" w:sz="0"/>
-            </w:tcBorders>
-            <w:tcMar>
-              <w:top w:type="dxa" w:w="75"/>
-              <w:left w:type="dxa" w:w="150"/>
-              <w:bottom w:type="dxa" w:w="75"/>
-              <w:right w:type="dxa" w:w="120"/>
-            </w:tcMar>
-          </w:tcPr>
-          <w:p>
-            <w:pPr>
-              <w:spacing w:after="0" w:before="0" w:line="240"/>
-            </w:pPr>
-            <w:r>
-              <w:rPr>
-                <w:rFonts w:ascii="Arial" w:cs="Arial" w:eastAsia="Arial" w:hAnsi="Arial"/>
-                <w:i/>
-                <w:iCs/>
-                <w:color w:val="9AA6B6"/>
-                <w:sz w:val="17"/>
-                <w:szCs w:val="17"/>
-              </w:rPr>
-              <w:t xml:space="preserve">[Description of service]</w:t>
-            </w:r>
-          </w:p>
-        </w:tc>
-        <w:tc>
-          <w:tcPr>
-            <w:tcW w:type="dxa" w:w="2500"/>
-            <w:tcBorders>
-              <w:top w:val="none" w:color="FFFFFF" w:sz="0"/>
-              <w:left w:val="none" w:color="FFFFFF" w:sz="0"/>
-              <w:bottom w:val="single" w:color="E3DDD2" w:sz="3"/>
-              <w:right w:val="none" w:color="FFFFFF" w:sz="0"/>
-            </w:tcBorders>
-            <w:tcMar>
-              <w:top w:type="dxa" w:w="75"/>
-              <w:left w:type="dxa" w:w="0"/>
-              <w:bottom w:type="dxa" w:w="75"/>
-              <w:right w:type="dxa" w:w="150"/>
-            </w:tcMar>
-          </w:tcPr>
-          <w:p>
-            <w:pPr>
-              <w:spacing w:after="0" w:before="0" w:line="240"/>
-              <w:jc w:val="right"/>
-            </w:pPr>
-            <w:r>
-              <w:rPr>
-                <w:rFonts w:ascii="Arial" w:cs="Arial" w:eastAsia="Arial" w:hAnsi="Arial"/>
-                <w:i/>
-                <w:iCs/>
-                <w:color w:val="9AA6B6"/>
-                <w:sz w:val="17"/>
-                <w:szCs w:val="17"/>
-              </w:rPr>
-              <w:t xml:space="preserve">R</w:t>
-            </w:r>
-          </w:p>
-        </w:tc>
-      </w:tr>
-      <w:tr>
-        <w:tc>
-          <w:tcPr>
-            <w:tcW w:type="dxa" w:w="7704"/>
-            <w:tcBorders>
-              <w:top w:val="none" w:color="FFFFFF" w:sz="0"/>
-              <w:left w:val="none" w:color="FFFFFF" w:sz="0"/>
-              <w:bottom w:val="single" w:color="E3DDD2" w:sz="3"/>
-              <w:right w:val="none" w:color="FFFFFF" w:sz="0"/>
-            </w:tcBorders>
-            <w:tcMar>
-              <w:top w:type="dxa" w:w="75"/>
-              <w:left w:type="dxa" w:w="150"/>
-              <w:bottom w:type="dxa" w:w="75"/>
-              <w:right w:type="dxa" w:w="120"/>
-            </w:tcMar>
-          </w:tcPr>
-          <w:p>
-            <w:pPr>
-              <w:spacing w:after="0" w:before="0" w:line="240"/>
-            </w:pPr>
-            <w:r>
-              <w:rPr>
-                <w:rFonts w:ascii="Arial" w:cs="Arial" w:eastAsia="Arial" w:hAnsi="Arial"/>
-                <w:i/>
-                <w:iCs/>
-                <w:color w:val="9AA6B6"/>
-                <w:sz w:val="17"/>
-                <w:szCs w:val="17"/>
-              </w:rPr>
-              <w:t xml:space="preserve">[Description of service]</w:t>
-            </w:r>
-          </w:p>
-        </w:tc>
-        <w:tc>
-          <w:tcPr>
-            <w:tcW w:type="dxa" w:w="2500"/>
-            <w:tcBorders>
-              <w:top w:val="none" w:color="FFFFFF" w:sz="0"/>
-              <w:left w:val="none" w:color="FFFFFF" w:sz="0"/>
-              <w:bottom w:val="single" w:color="E3DDD2" w:sz="3"/>
-              <w:right w:val="none" w:color="FFFFFF" w:sz="0"/>
-            </w:tcBorders>
-            <w:tcMar>
-              <w:top w:type="dxa" w:w="75"/>
-              <w:left w:type="dxa" w:w="0"/>
-              <w:bottom w:type="dxa" w:w="75"/>
-              <w:right w:type="dxa" w:w="150"/>
-            </w:tcMar>
-          </w:tcPr>
-          <w:p>
-            <w:pPr>
-              <w:spacing w:after="0" w:before="0" w:line="240"/>
-              <w:jc w:val="right"/>
-            </w:pPr>
-            <w:r>
-              <w:rPr>
-                <w:rFonts w:ascii="Arial" w:cs="Arial" w:eastAsia="Arial" w:hAnsi="Arial"/>
-                <w:i/>
-                <w:iCs/>
-                <w:color w:val="9AA6B6"/>
-                <w:sz w:val="17"/>
-                <w:szCs w:val="17"/>
-              </w:rPr>
-              <w:t xml:space="preserve">R</w:t>
-            </w:r>
-          </w:p>
-        </w:tc>
-      </w:tr>
     </w:tbl>
     <w:p>
       <w:pPr>
@@ -2103,7 +1965,7 @@
     </w:tbl>
     <w:p>
       <w:pPr>
-        <w:spacing w:after="260"/>
+        <w:spacing w:after="190"/>
       </w:pPr>
     </w:p>
     <w:tbl>
@@ -2375,7 +2237,7 @@
     </w:tbl>
     <w:p>
       <w:pPr>
-        <w:spacing w:after="260"/>
+        <w:spacing w:after="120"/>
       </w:pPr>
     </w:p>
     <w:p>
@@ -2413,7 +2275,7 @@
     </w:p>
     <w:sectPr>
       <w:pgSz w:w="11906" w:h="16838" w:orient="portrait"/>
-      <w:pgMar w:top="680" w:right="851" w:bottom="567" w:left="851" w:header="708" w:footer="708" w:gutter="0"/>
+      <w:pgMar w:top="620" w:right="851" w:bottom="400" w:left="851" w:header="708" w:footer="708" w:gutter="0"/>
       <w:pgNumType/>
       <w:docGrid w:linePitch="360"/>
     </w:sectPr>

</xml_diff>